<commit_message>
Redact DOB from Fabi letter docx
Co-Authored-By: Claude Opus 4.6 (1M context) <noreply@anthropic.com>
</commit_message>
<xml_diff>
--- a/Hornletter20260410-Fabi-Air-Letter-April-10.docx
+++ b/Hornletter20260410-Fabi-Air-Letter-April-10.docx
@@ -242,12 +242,7 @@
         </w:rPr>
       </w:pPr>
       <w:r>
-        <w:rPr>
-          <w:rFonts w:ascii="Courier New" w:hAnsi="Courier New" w:cs="Courier New"/>
-          <w:sz w:val="24"/>
-          <w:szCs w:val="24"/>
-        </w:rPr>
-        <w:t>DOB: 02/06/1984</w:t>
+        <w:t>DOB: [REDACTED]</w:t>
       </w:r>
     </w:p>
     <w:p>

</xml_diff>